<commit_message>
Fix xlsx filename reference, add sourced benchmarks, clarify metric definitions
Co-Authored-By: Claude Sonnet 5.5 <noreply@anthropic.com>
Claude-Session: https://claude.ai/code/session_01SjhjLfrHaW3Y2DdKuDNrJC
</commit_message>
<xml_diff>
--- a/deliverables/Assignment3_Raincouver_AI_Answers.docx
+++ b/deliverables/Assignment3_Raincouver_AI_Answers.docx
@@ -15,7 +15,7 @@
         <w:spacing w:after="120"/>
       </w:pPr>
       <w:r>
-        <w:t>COMM/R &amp; COEC 387 - Entrepreneurial Finance and Private Equity. Supporting calculations: Assignment3_Solutions.xlsx, sheet "Raincouver Metrics" (all figures below are linked to the model by formula; $ in thousands unless noted).</w:t>
+        <w:t>COMM/R &amp; COEC 387 - Entrepreneurial Finance and Private Equity. Supporting calculations: Assignment3_回答.xlsx, sheet "Raincouver Metrics" (all figures below are linked to the model by formula; $ in thousands unless noted).</w:t>
       </w:r>
     </w:p>
     <w:p>
@@ -154,7 +154,7 @@
                 <w:b/>
                 <w:sz w:val="17"/>
               </w:rPr>
-              <w:t>Benchmark (approx.)</w:t>
+              <w:t>Benchmark (source)</w:t>
             </w:r>
           </w:p>
         </w:tc>
@@ -254,7 +254,7 @@
                 <w:b w:val="0"/>
                 <w:sz w:val="17"/>
               </w:rPr>
-              <w:t>Median 35-50%; top quartile 80-100%+</w:t>
+              <w:t>Median ~19% (KeyBanc/Sapphire 2024)</w:t>
             </w:r>
           </w:p>
         </w:tc>
@@ -268,7 +268,7 @@
                 <w:b w:val="0"/>
                 <w:sz w:val="17"/>
               </w:rPr>
-              <w:t>Top quartile</w:t>
+              <w:t>Far above median</w:t>
             </w:r>
           </w:p>
         </w:tc>
@@ -368,7 +368,7 @@
                 <w:b w:val="0"/>
                 <w:sz w:val="17"/>
               </w:rPr>
-              <w:t>Top quartile</w:t>
+              <w:t>Far above median</w:t>
             </w:r>
           </w:p>
         </w:tc>
@@ -454,7 +454,7 @@
                 <w:b w:val="0"/>
                 <w:sz w:val="17"/>
               </w:rPr>
-              <w:t>Median 100-105%; top quartile &gt;120%</w:t>
+              <w:t>Median ~101% (KeyBanc/Sapphire 2024); ~106% median, ~124% top quartile (Paddle 2024)</w:t>
             </w:r>
           </w:p>
         </w:tc>
@@ -554,7 +554,7 @@
                 <w:b w:val="0"/>
                 <w:sz w:val="17"/>
               </w:rPr>
-              <w:t>Median 10-15% (GRR 85-90%)</w:t>
+              <w:t>GRR median ~90% (KeyBanc/Sapphire 2024; Bain 2023 ~91%)</w:t>
             </w:r>
           </w:p>
         </w:tc>
@@ -568,7 +568,7 @@
                 <w:b w:val="0"/>
                 <w:sz w:val="17"/>
               </w:rPr>
-              <w:t>Bottom quartile</w:t>
+              <w:t>Well below median</w:t>
             </w:r>
           </w:p>
         </w:tc>
@@ -654,7 +654,7 @@
                 <w:b w:val="0"/>
                 <w:sz w:val="17"/>
               </w:rPr>
-              <w:t>Median 75-78%; top &gt;80%</w:t>
+              <w:t>~75-80% rule of thumb (not verified)</w:t>
             </w:r>
           </w:p>
         </w:tc>
@@ -668,7 +668,7 @@
                 <w:b w:val="0"/>
                 <w:sz w:val="17"/>
               </w:rPr>
-              <w:t>Median / slightly below</w:t>
+              <w:t>Around / slightly below</w:t>
             </w:r>
           </w:p>
         </w:tc>
@@ -754,7 +754,7 @@
                 <w:b w:val="0"/>
                 <w:sz w:val="17"/>
               </w:rPr>
-              <w:t>Median 35-45%</w:t>
+              <w:t>~35-45% rule of thumb (not verified)</w:t>
             </w:r>
           </w:p>
         </w:tc>
@@ -768,7 +768,7 @@
                 <w:b w:val="0"/>
                 <w:sz w:val="17"/>
               </w:rPr>
-              <w:t>Bottom quartile</w:t>
+              <w:t>Far above</w:t>
             </w:r>
           </w:p>
         </w:tc>
@@ -854,7 +854,7 @@
                 <w:b w:val="0"/>
                 <w:sz w:val="17"/>
               </w:rPr>
-              <w:t>Median about -20% to -30%</w:t>
+              <w:t>No verified median</w:t>
             </w:r>
           </w:p>
         </w:tc>
@@ -868,7 +868,7 @@
                 <w:b w:val="0"/>
                 <w:sz w:val="17"/>
               </w:rPr>
-              <w:t>Bottom quartile</w:t>
+              <w:t>Deeply negative</w:t>
             </w:r>
           </w:p>
         </w:tc>
@@ -954,7 +954,7 @@
                 <w:b w:val="0"/>
                 <w:sz w:val="17"/>
               </w:rPr>
-              <w:t>Median 10-20%; top &gt;40%</w:t>
+              <w:t>&gt;=40% standard threshold</w:t>
             </w:r>
           </w:p>
         </w:tc>
@@ -968,7 +968,7 @@
                 <w:b w:val="0"/>
                 <w:sz w:val="17"/>
               </w:rPr>
-              <w:t>Below median, improving</w:t>
+              <w:t>Below threshold, improving</w:t>
             </w:r>
           </w:p>
         </w:tc>
@@ -984,7 +984,7 @@
                 <w:b w:val="0"/>
                 <w:sz w:val="17"/>
               </w:rPr>
-              <w:t>Burn multiple</w:t>
+              <w:t>Burn multiple (op. loss proxy)</w:t>
             </w:r>
           </w:p>
         </w:tc>
@@ -1054,7 +1054,7 @@
                 <w:b w:val="0"/>
                 <w:sz w:val="17"/>
               </w:rPr>
-              <w:t>&lt;1.5x great; &gt;3x bad</w:t>
+              <w:t>&lt;1x excellent, &gt;2x warning (Sacks/Craft Ventures)</w:t>
             </w:r>
           </w:p>
         </w:tc>
@@ -1068,7 +1068,7 @@
                 <w:b w:val="0"/>
                 <w:sz w:val="17"/>
               </w:rPr>
-              <w:t>Great by FY24 (bad earlier)</w:t>
+              <w:t>Good by FY24; weak earlier</w:t>
             </w:r>
           </w:p>
         </w:tc>
@@ -1084,107 +1084,7 @@
                 <w:b w:val="0"/>
                 <w:sz w:val="17"/>
               </w:rPr>
-              <w:t>Sales efficiency (gross new ARR / S&amp;M)</w:t>
-            </w:r>
-          </w:p>
-        </w:tc>
-        <w:tc>
-          <w:tcPr>
-            <w:tcW w:type="dxa" w:w="1378"/>
-          </w:tcPr>
-          <w:p>
-            <w:r>
-              <w:rPr>
-                <w:b w:val="0"/>
-                <w:sz w:val="17"/>
-              </w:rPr>
-              <w:t>0.74x</w:t>
-            </w:r>
-          </w:p>
-        </w:tc>
-        <w:tc>
-          <w:tcPr>
-            <w:tcW w:type="dxa" w:w="1378"/>
-          </w:tcPr>
-          <w:p>
-            <w:r>
-              <w:rPr>
-                <w:b w:val="0"/>
-                <w:sz w:val="17"/>
-              </w:rPr>
-              <w:t>0.68x</w:t>
-            </w:r>
-          </w:p>
-        </w:tc>
-        <w:tc>
-          <w:tcPr>
-            <w:tcW w:type="dxa" w:w="1378"/>
-          </w:tcPr>
-          <w:p>
-            <w:r>
-              <w:rPr>
-                <w:b w:val="0"/>
-                <w:sz w:val="17"/>
-              </w:rPr>
-              <w:t>0.87x</w:t>
-            </w:r>
-          </w:p>
-        </w:tc>
-        <w:tc>
-          <w:tcPr>
-            <w:tcW w:type="dxa" w:w="1378"/>
-          </w:tcPr>
-          <w:p>
-            <w:r>
-              <w:rPr>
-                <w:b w:val="0"/>
-                <w:sz w:val="17"/>
-              </w:rPr>
-              <w:t>0.99x</w:t>
-            </w:r>
-          </w:p>
-        </w:tc>
-        <w:tc>
-          <w:tcPr>
-            <w:tcW w:type="dxa" w:w="1378"/>
-          </w:tcPr>
-          <w:p>
-            <w:r>
-              <w:rPr>
-                <w:b w:val="0"/>
-                <w:sz w:val="17"/>
-              </w:rPr>
-              <w:t>Median 0.7-0.8x</w:t>
-            </w:r>
-          </w:p>
-        </w:tc>
-        <w:tc>
-          <w:tcPr>
-            <w:tcW w:type="dxa" w:w="1378"/>
-          </w:tcPr>
-          <w:p>
-            <w:r>
-              <w:rPr>
-                <w:b w:val="0"/>
-                <w:sz w:val="17"/>
-              </w:rPr>
-              <w:t>Median to upper quartile</w:t>
-            </w:r>
-          </w:p>
-        </w:tc>
-      </w:tr>
-      <w:tr>
-        <w:tc>
-          <w:tcPr>
-            <w:tcW w:type="dxa" w:w="1378"/>
-          </w:tcPr>
-          <w:p>
-            <w:r>
-              <w:rPr>
-                <w:b w:val="0"/>
-                <w:sz w:val="17"/>
-              </w:rPr>
-              <w:t>CAC payback (GM-adjusted)</w:t>
+              <w:t>CAC payback, blended (GM-adj.)</w:t>
             </w:r>
           </w:p>
         </w:tc>
@@ -1254,7 +1154,7 @@
                 <w:b w:val="0"/>
                 <w:sz w:val="17"/>
               </w:rPr>
-              <w:t>Median 20-24 mo; top &lt;15</w:t>
+              <w:t>Median ~18 mo (OpenView 2024); ~19 mo (SaaS Capital FY23); ~23 mo (KeyBanc 2023)</w:t>
             </w:r>
           </w:p>
         </w:tc>
@@ -1268,7 +1168,107 @@
                 <w:b w:val="0"/>
                 <w:sz w:val="17"/>
               </w:rPr>
-              <w:t>Median to upper-mid</w:t>
+              <w:t>Better than median by FY24</w:t>
+            </w:r>
+          </w:p>
+        </w:tc>
+      </w:tr>
+      <w:tr>
+        <w:tc>
+          <w:tcPr>
+            <w:tcW w:type="dxa" w:w="1378"/>
+          </w:tcPr>
+          <w:p>
+            <w:r>
+              <w:rPr>
+                <w:b w:val="0"/>
+                <w:sz w:val="17"/>
+              </w:rPr>
+              <w:t>CAC payback, new-logo only</w:t>
+            </w:r>
+          </w:p>
+        </w:tc>
+        <w:tc>
+          <w:tcPr>
+            <w:tcW w:type="dxa" w:w="1378"/>
+          </w:tcPr>
+          <w:p>
+            <w:r>
+              <w:rPr>
+                <w:b w:val="0"/>
+                <w:sz w:val="17"/>
+              </w:rPr>
+              <w:t>40 mo</w:t>
+            </w:r>
+          </w:p>
+        </w:tc>
+        <w:tc>
+          <w:tcPr>
+            <w:tcW w:type="dxa" w:w="1378"/>
+          </w:tcPr>
+          <w:p>
+            <w:r>
+              <w:rPr>
+                <w:b w:val="0"/>
+                <w:sz w:val="17"/>
+              </w:rPr>
+              <w:t>42 mo</w:t>
+            </w:r>
+          </w:p>
+        </w:tc>
+        <w:tc>
+          <w:tcPr>
+            <w:tcW w:type="dxa" w:w="1378"/>
+          </w:tcPr>
+          <w:p>
+            <w:r>
+              <w:rPr>
+                <w:b w:val="0"/>
+                <w:sz w:val="17"/>
+              </w:rPr>
+              <w:t>31 mo</w:t>
+            </w:r>
+          </w:p>
+        </w:tc>
+        <w:tc>
+          <w:tcPr>
+            <w:tcW w:type="dxa" w:w="1378"/>
+          </w:tcPr>
+          <w:p>
+            <w:r>
+              <w:rPr>
+                <w:b w:val="0"/>
+                <w:sz w:val="17"/>
+              </w:rPr>
+              <w:t>30 mo</w:t>
+            </w:r>
+          </w:p>
+        </w:tc>
+        <w:tc>
+          <w:tcPr>
+            <w:tcW w:type="dxa" w:w="1378"/>
+          </w:tcPr>
+          <w:p>
+            <w:r>
+              <w:rPr>
+                <w:b w:val="0"/>
+                <w:sz w:val="17"/>
+              </w:rPr>
+              <w:t>No direct benchmark (stricter definition)</w:t>
+            </w:r>
+          </w:p>
+        </w:tc>
+        <w:tc>
+          <w:tcPr>
+            <w:tcW w:type="dxa" w:w="1378"/>
+          </w:tcPr>
+          <w:p>
+            <w:r>
+              <w:rPr>
+                <w:b w:val="0"/>
+                <w:sz w:val="17"/>
+              </w:rPr>
+              <w:t>Conservative bound</w:t>
             </w:r>
           </w:p>
         </w:tc>
@@ -1286,7 +1286,7 @@
         <w:t xml:space="preserve">Summary. </w:t>
       </w:r>
       <w:r>
-        <w:t>Raincouver AI is a top-quartile growth company with bottom-quartile efficiency. Growth (ARR roughly doubling every year, from $14.5M to $111.6M by FY24) and expansion (NRR 117-129%, driven by upsell and expansion equal to 46-58% of opening ARR) are excellent. Costs are the weakness: churn is very high (gross churn 22-48% of opening ARR, SMB-like, vs a ~10-15% median), gross margin is below the best-in-class 80%, and operating expenses are enormous (S&amp;M 92-167% of revenue, operating margin -82% to -237%). The trajectory is steeply improving: burn multiple falls from 3.0x to 1.1x, CAC payback from 25 to 16 months and Rule of 40 from -103% to +17%. These are forecasts, though, and need to be tested.</w:t>
+        <w:t>Raincouver AI has far-above-median growth but weak efficiency. Growth (ARR roughly doubling every year, from $14.5M to $111.6M by FY24; the survey median is ~19%) and expansion (NRR 117-129% vs ~101% median, driven by upsell and expansion equal to 46-58% of opening ARR) are excellent. Costs are the weakness: churn is very high (gross churn 22-48% of opening ARR vs ~10% median), gross margin is around or below the usual 75-80% range, and operating expenses are enormous (S&amp;M 92-167% of revenue, operating margin -82% to -237%). The trajectory is steeply improving: burn multiple falls from 3.0x to 1.1x, blended CAC payback from 25 to 16 months and Rule of 40 from -103% to +17%. These are forecasts, though, and need to be tested.</w:t>
       </w:r>
     </w:p>
     <w:p>
@@ -1297,10 +1297,24 @@
         <w:rPr>
           <w:b/>
         </w:rPr>
-        <w:t xml:space="preserve">Sources and notes. </w:t>
+        <w:t xml:space="preserve">Caveats. </w:t>
       </w:r>
       <w:r>
-        <w:t>Benchmark sources: KeyBanc Capital Markets / Sapphire Ventures Private SaaS Company Survey; OpenView SaaS Benchmarks; ICONIQ Growth Topline Growth &amp; Operational Efficiency report; Craft Ventures (D. Sacks) "The Burn Multiple"; Bessemer Venture Partners "Scaling to $100 Million". Benchmark values are approximate ranges recalled from these published surveys, not exact quotes, and should be checked against the latest editions. Operating loss is used as a proxy for burn because the model has no cash-flow statement. Definitions: NRR = (opening ARR + upsell + expansion - churn) / opening ARR; GRR = 1 - churn / opening ARR; CAC payback = S&amp;M / (gross new ARR x gross margin) x 12.</w:t>
+        <w:t>Limits of the comparison. (1) The burn multiple uses operating loss as a proxy for cash burn, because the model has no cash-flow statement; true cash burn could differ (working capital, capitalised costs, D&amp;A). (2) Blended CAC payback uses gross new ARR, which includes upsell and expansion from existing customers; this is the common survey form but flatters the result. The stricter new-logo-only version (all S&amp;M charged to new logos) is 30-42 months, so the true figure lies between the two. (3) Benchmarks for growth, retention, CAC payback and burn multiple are sourced below; gross margin, cost ratios and sales efficiency are rule-of-thumb ranges that I could not tie to a specific published table, and are labelled 'not verified'. Quartile cut-offs were not available, so I compare with medians and describe results as above/below median rather than assigning exact quartiles.</w:t>
+      </w:r>
+    </w:p>
+    <w:p>
+      <w:pPr>
+        <w:spacing w:after="120"/>
+      </w:pPr>
+      <w:r>
+        <w:rPr>
+          <w:b/>
+        </w:rPr>
+        <w:t xml:space="preserve">Sources. </w:t>
+      </w:r>
+      <w:r>
+        <w:t>(1) KeyBanc Capital Markets &amp; Sapphire Ventures, 2024 Private SaaS Company Survey (15th annual, Oct 2024): median growth ~19%, GRR ~90%, NRR ~101% - https://info.sapphireventures.com/2024-keybanc-capital-markets-and-sapphire-ventures-saas-survey. (2) KeyBanc/Sapphire 2023 survey (2022 data): CAC payback ~23 months (as cited by secondary sources). (3) OpenView 2024 SaaS Benchmarks: median CAC payback ~18 months, cited via The Starr Conspiracy - https://www.thestarrconspiracy.com/insights/benchmarks/b2b-marketing-unit-economics-benchmarks-2024. (4) Paddle 2024 benchmark (NRR ~106% median, ~124% top quartile), cited via Orb - https://www.withorb.com/blog/net-revenue-retention-statistics; Bain 2023 GRR ~91%. (5) D. Sacks, Craft Ventures, 'The Burn Multiple'; thresholds as summarised by Hustle Fund - https://www.hustlefund.vc/post/angel-squad-david-sacks-investments-the-paypal-mafia-playbook-for-saas-and-crypto. Items (3), (4), (5) are secondary sources; the primary reports should be checked before final submission. Definitions: NRR = (opening ARR + upsell + expansion - churn) / opening ARR; GRR = 1 - churn / opening ARR; CAC payback = S&amp;M / (gross new ARR x gross margin) x 12.</w:t>
       </w:r>
     </w:p>
     <w:p>
@@ -1316,7 +1330,7 @@
         <w:spacing w:after="120"/>
       </w:pPr>
       <w:r>
-        <w:t>Yes - a conditional, staged investment. Why: (1) Growth and demand: ARR has roughly doubled each year and revenue growth is ~100%, which is the profile venture returns need. (2) Expansion: NRR of 117-129% shows customers buy more over time, which usually means real product value rather than a pilot-driven spike. (3) Improving unit economics: burn multiple 3.0x to 1.1x, CAC payback 25 to 16 months, gross margin 64.5% to 75.9%, and operating margin -237% to -82%. The business appears to scale efficiently as it grows. Concerns: (1) Churn is very high (22-48% of opening ARR); the high NRR is made up of heavy upsell masking a leaky base, so I need cohort data by customer size to see whether churn is concentrated in small customers or an early-product issue. (2) Operating losses are large ($58M in FY24), so we must see the cash balance, runway and what the round buys. (3) Forecast risk: FY24 inputs are rounded hard-codes, ARR exceeds revenue run-rate by ~30% in Q4-24, and the model has a base-period inconsistency (Q1-21 growth uses 6,412 rather than 7,912). (4) AI-specific risk: 65-76% gross margin may be exposed to inference costs and model-provider competition. Terms: I would invest, but price it on FY22-23 numbers, not FY24 hockey-stick forecasts; tranche the money against milestones (gross churn below 20%, gross margin above 75%, burn multiple below 1.5x); and use standard protections (liquidation preference, information rights and a board seat). If diligence shows that churn is structural, I would pass.</w:t>
+        <w:t>Yes - a conditional, staged investment. Why: (1) Growth and demand: ARR has roughly doubled each year and revenue growth is ~100%, which is the profile venture returns need. (2) Expansion: NRR of 117-129% (vs a ~101% median) shows customers buy more over time, which usually means real product value rather than a pilot-driven spike. (3) Improving unit economics: burn multiple 3.0x to 1.1x, CAC payback 25 to 16 months, gross margin 64.5% to 75.9%, and operating margin -237% to -82%. The business appears to scale efficiently as it grows. Concerns: (1) Churn is very high (22-48% of opening ARR); the high NRR is made up of heavy upsell masking a leaky base, so I need cohort data by customer size to see whether churn is concentrated in small customers or an early-product issue. (2) Operating losses are large ($58M in FY24), so we must see the cash balance, runway and what the round buys. (3) Forecast risk: FY24 inputs are rounded hard-codes, ARR exceeds revenue run-rate by ~30% in Q4-24, and the model has a base-period inconsistency (Q1-21 growth uses 6,412 rather than 7,912). (4) AI-specific risk: 65-76% gross margin may be exposed to inference costs and model-provider competition. Terms: I would invest, but price it on FY22-23 numbers, not FY24 hockey-stick forecasts; tranche the money against milestones (gross churn below 20%, gross margin above 75%, burn multiple below 1.5x); and use standard protections (liquidation preference, information rights and a board seat). If diligence shows that churn is structural, I would pass.</w:t>
       </w:r>
     </w:p>
     <w:sectPr>

</xml_diff>